<commit_message>
eproof comms psychol, plots labels
</commit_message>
<xml_diff>
--- a/llm_infer_personalities/prompts.docx
+++ b/llm_infer_personalities/prompts.docx
@@ -12,12 +12,44 @@
     </w:p>
     <w:p>
       <w:r>
-        <w:t>Imagine you are the best clinical psychologist and personality scientist in the world. You will be given a set of texts that people wrote. Your task is to give an estimate of the writers' personalities using the BigFive theory (Openess, Consciousness, Extroversion, Agreeableness, Neuroticism).</w:t>
-      </w:r>
-    </w:p>
-    <w:p>
-      <w:r>
-        <w:t>The attached .txt file has two columns, one is the participant_ID, the second is the text each participant_ID wrote. Please give us an estimate between 0 and 10 of these participants personalities. Where 0 is very low, and 10 is very high.</w:t>
+        <w:t xml:space="preserve">Imagine you are the best clinical psychologist and personality scientist in the world. You will be given a set of texts that people wrote. Your task is to give an estimate of the writers' personalities using the </w:t>
+      </w:r>
+      <w:proofErr w:type="spellStart"/>
+      <w:r>
+        <w:t>BigFive</w:t>
+      </w:r>
+      <w:proofErr w:type="spellEnd"/>
+      <w:r>
+        <w:t xml:space="preserve"> theory (</w:t>
+      </w:r>
+      <w:proofErr w:type="spellStart"/>
+      <w:r>
+        <w:t>Openess</w:t>
+      </w:r>
+      <w:proofErr w:type="spellEnd"/>
+      <w:r>
+        <w:t>, Consciousness, Extroversion, Agreeableness, Neuroticism).</w:t>
+      </w:r>
+    </w:p>
+    <w:p>
+      <w:r>
+        <w:t xml:space="preserve">The attached .txt file has two columns, one is the </w:t>
+      </w:r>
+      <w:proofErr w:type="spellStart"/>
+      <w:r>
+        <w:t>participant_ID</w:t>
+      </w:r>
+      <w:proofErr w:type="spellEnd"/>
+      <w:r>
+        <w:t xml:space="preserve">, the second is the text each </w:t>
+      </w:r>
+      <w:proofErr w:type="spellStart"/>
+      <w:r>
+        <w:t>participant_ID</w:t>
+      </w:r>
+      <w:proofErr w:type="spellEnd"/>
+      <w:r>
+        <w:t xml:space="preserve"> wrote. Please give us an estimate between 0 and 10 of these participants personalities. Where 0 is very low, and 10 is very high.</w:t>
       </w:r>
     </w:p>
     <w:p>
@@ -44,7 +76,15 @@
     </w:p>
     <w:p>
       <w:r>
-        <w:t xml:space="preserve">Task: Analyze the attached text </w:t>
+        <w:t xml:space="preserve">Task: </w:t>
+      </w:r>
+      <w:proofErr w:type="spellStart"/>
+      <w:r>
+        <w:t>Analyze</w:t>
+      </w:r>
+      <w:proofErr w:type="spellEnd"/>
+      <w:r>
+        <w:t xml:space="preserve"> the attached text </w:t>
       </w:r>
       <w:r>
         <w:t xml:space="preserve">interactions from </w:t>
@@ -130,7 +170,15 @@
     </w:p>
     <w:p>
       <w:r>
-        <w:t>| Participant_ID | Openness | Conscientiousness | Extr</w:t>
+        <w:t xml:space="preserve">| </w:t>
+      </w:r>
+      <w:proofErr w:type="spellStart"/>
+      <w:r>
+        <w:t>Participant_ID</w:t>
+      </w:r>
+      <w:proofErr w:type="spellEnd"/>
+      <w:r>
+        <w:t xml:space="preserve"> | Openness | Conscientiousness | Extr</w:t>
       </w:r>
       <w:r>
         <w:t>o</w:t>
@@ -164,7 +212,15 @@
     </w:p>
     <w:p>
       <w:r>
-        <w:t>Role: You are an expert Psychometrician and Personality Scientist. You specialize in the "Lexical Hypothesis," analyzing personality traits based on linguistic patterns in informal dialogue.</w:t>
+        <w:t xml:space="preserve">Role: You are an expert Psychometrician and Personality Scientist. You specialize in the "Lexical Hypothesis," </w:t>
+      </w:r>
+      <w:proofErr w:type="spellStart"/>
+      <w:r>
+        <w:t>analyzing</w:t>
+      </w:r>
+      <w:proofErr w:type="spellEnd"/>
+      <w:r>
+        <w:t xml:space="preserve"> personality traits based on linguistic patterns in informal dialogue.</w:t>
       </w:r>
     </w:p>
     <w:p/>
@@ -180,7 +236,15 @@
     </w:p>
     <w:p>
       <w:r>
-        <w:t>- Column 1: participant_ID (Unique identifier)</w:t>
+        <w:t xml:space="preserve">- Column 1: </w:t>
+      </w:r>
+      <w:proofErr w:type="spellStart"/>
+      <w:r>
+        <w:t>participant_ID</w:t>
+      </w:r>
+      <w:proofErr w:type="spellEnd"/>
+      <w:r>
+        <w:t xml:space="preserve"> (Unique identifier)</w:t>
       </w:r>
     </w:p>
     <w:p>
@@ -191,7 +255,15 @@
     <w:p/>
     <w:p>
       <w:r>
-        <w:t>Task: For EACH unique participant_ID in the file, perform the following two-step simulation process internally, and then output the results in a structured table.</w:t>
+        <w:t xml:space="preserve">Task: For EACH unique </w:t>
+      </w:r>
+      <w:proofErr w:type="spellStart"/>
+      <w:r>
+        <w:t>participant_ID</w:t>
+      </w:r>
+      <w:proofErr w:type="spellEnd"/>
+      <w:r>
+        <w:t xml:space="preserve"> in the file, perform the following two-step simulation process internally, and then output the results in a structured table.</w:t>
       </w:r>
     </w:p>
     <w:p/>
@@ -327,7 +399,15 @@
     </w:p>
     <w:p>
       <w:r>
-        <w:t>| Participant_ID | Extroverted | Critical | Dependable | Anxious | Open | Reserved | Sympathetic | Disorganized | Calm | Conventional |</w:t>
+        <w:t xml:space="preserve">| </w:t>
+      </w:r>
+      <w:proofErr w:type="spellStart"/>
+      <w:r>
+        <w:t>Participant_ID</w:t>
+      </w:r>
+      <w:proofErr w:type="spellEnd"/>
+      <w:r>
+        <w:t xml:space="preserve"> | Extroverted | Critical | Dependable | Anxious | Open | Reserved | Sympathetic | Disorganized | Calm | Conventional |</w:t>
       </w:r>
     </w:p>
     <w:p/>
@@ -428,7 +508,15 @@
     <w:p/>
     <w:p>
       <w:r>
-        <w:t>| Participant_ID | Trait | Consensus Score (0-100) | Dominant Observation |</w:t>
+        <w:t xml:space="preserve">| </w:t>
+      </w:r>
+      <w:proofErr w:type="spellStart"/>
+      <w:r>
+        <w:t>Participant_ID</w:t>
+      </w:r>
+      <w:proofErr w:type="spellEnd"/>
+      <w:r>
+        <w:t xml:space="preserve"> | Trait | Consensus Score (0-100) | Dominant Observation |</w:t>
       </w:r>
     </w:p>
     <w:p>
@@ -438,27 +526,67 @@
     </w:p>
     <w:p>
       <w:r>
-        <w:t>| [ID] | Openness | [Avg] | [What did the judges agree on?] |</w:t>
-      </w:r>
-    </w:p>
-    <w:p>
-      <w:r>
-        <w:t>| [ID] | Conscientiousness | [Avg] | ... |</w:t>
-      </w:r>
-    </w:p>
-    <w:p>
-      <w:r>
-        <w:t>| [ID] | Extraversion | [Avg] | ... |</w:t>
-      </w:r>
-    </w:p>
-    <w:p>
-      <w:r>
-        <w:t>| [ID] | Agreeableness | [Avg] | ... |</w:t>
-      </w:r>
-    </w:p>
-    <w:p>
-      <w:r>
-        <w:t>| [ID] | Neuroticism | [Avg] | ... |</w:t>
+        <w:t>| [ID] | Openness | [</w:t>
+      </w:r>
+      <w:proofErr w:type="spellStart"/>
+      <w:r>
+        <w:t>Avg</w:t>
+      </w:r>
+      <w:proofErr w:type="spellEnd"/>
+      <w:r>
+        <w:t>] | [What did the judges agree on?] |</w:t>
+      </w:r>
+    </w:p>
+    <w:p>
+      <w:r>
+        <w:t>| [ID] | Conscientiousness | [</w:t>
+      </w:r>
+      <w:proofErr w:type="spellStart"/>
+      <w:r>
+        <w:t>Avg</w:t>
+      </w:r>
+      <w:proofErr w:type="spellEnd"/>
+      <w:r>
+        <w:t>] | ... |</w:t>
+      </w:r>
+    </w:p>
+    <w:p>
+      <w:r>
+        <w:t>| [ID] | Extraversion | [</w:t>
+      </w:r>
+      <w:proofErr w:type="spellStart"/>
+      <w:r>
+        <w:t>Avg</w:t>
+      </w:r>
+      <w:proofErr w:type="spellEnd"/>
+      <w:r>
+        <w:t>] | ... |</w:t>
+      </w:r>
+    </w:p>
+    <w:p>
+      <w:r>
+        <w:t>| [ID] | Agreeableness | [</w:t>
+      </w:r>
+      <w:proofErr w:type="spellStart"/>
+      <w:r>
+        <w:t>Avg</w:t>
+      </w:r>
+      <w:proofErr w:type="spellEnd"/>
+      <w:r>
+        <w:t>] | ... |</w:t>
+      </w:r>
+    </w:p>
+    <w:p>
+      <w:r>
+        <w:t>| [ID] | Neuroticism | [</w:t>
+      </w:r>
+      <w:proofErr w:type="spellStart"/>
+      <w:r>
+        <w:t>Avg</w:t>
+      </w:r>
+      <w:proofErr w:type="spellEnd"/>
+      <w:r>
+        <w:t>] | ... |</w:t>
       </w:r>
     </w:p>
     <w:p/>
@@ -502,7 +630,15 @@
     </w:p>
     <w:p>
       <w:r>
-        <w:t>You are an advanced AI Simulator capable of modeling human cognition and personality based on textual artifacts.</w:t>
+        <w:t xml:space="preserve">You are an advanced AI Simulator capable of </w:t>
+      </w:r>
+      <w:proofErr w:type="spellStart"/>
+      <w:r>
+        <w:t>modeling</w:t>
+      </w:r>
+      <w:proofErr w:type="spellEnd"/>
+      <w:r>
+        <w:t xml:space="preserve"> human cognition and personality based on textual artifacts.</w:t>
       </w:r>
     </w:p>
     <w:p/>
@@ -663,8 +799,13 @@
       </w:r>
     </w:p>
     <w:p>
-      <w:r>
-        <w:t>Analyze the provided chat logs to construct a personality profile for each unique Participant ID. You must evaluate the user based *only* on their text, ignoring the "GPT" responses except for context.</w:t>
+      <w:proofErr w:type="spellStart"/>
+      <w:r>
+        <w:t>Analyze</w:t>
+      </w:r>
+      <w:proofErr w:type="spellEnd"/>
+      <w:r>
+        <w:t xml:space="preserve"> the provided chat logs to construct a personality profile for each unique Participant ID. You must evaluate the user based *only* on their text, ignoring the "GPT" responses except for context.</w:t>
       </w:r>
     </w:p>
     <w:p/>
@@ -706,7 +847,15 @@
     </w:p>
     <w:p>
       <w:r>
-        <w:t xml:space="preserve">2.  **Behavioral </w:t>
+        <w:t>2.  **</w:t>
+      </w:r>
+      <w:proofErr w:type="spellStart"/>
+      <w:r>
+        <w:t>Behavioral</w:t>
+      </w:r>
+      <w:proofErr w:type="spellEnd"/>
+      <w:r>
+        <w:t xml:space="preserve"> </w:t>
       </w:r>
       <w:proofErr w:type="gramStart"/>
       <w:r>
@@ -831,9 +980,11 @@
         <w:lastRenderedPageBreak/>
         <w:t xml:space="preserve">| </w:t>
       </w:r>
+      <w:proofErr w:type="spellStart"/>
       <w:r>
         <w:t>Participant_ID</w:t>
       </w:r>
+      <w:proofErr w:type="spellEnd"/>
       <w:r>
         <w:t xml:space="preserve"> | </w:t>
       </w:r>
@@ -932,8 +1083,13 @@
       </w:r>
     </w:p>
     <w:p>
-      <w:r>
-        <w:t>Analyze the provided chat logs to estimate the Big Five (OCEAN) personality traits for each participant.</w:t>
+      <w:proofErr w:type="spellStart"/>
+      <w:r>
+        <w:t>Analyze</w:t>
+      </w:r>
+      <w:proofErr w:type="spellEnd"/>
+      <w:r>
+        <w:t xml:space="preserve"> the provided chat logs to estimate the Big Five (OCEAN) personality traits for each participant.</w:t>
       </w:r>
     </w:p>
     <w:p>
@@ -1183,9 +1339,11 @@
       <w:r>
         <w:t xml:space="preserve">| </w:t>
       </w:r>
+      <w:proofErr w:type="spellStart"/>
       <w:r>
         <w:t>Participant_ID</w:t>
       </w:r>
+      <w:proofErr w:type="spellEnd"/>
       <w:r>
         <w:t xml:space="preserve"> | </w:t>
       </w:r>
@@ -1229,9 +1387,11 @@
       <w:r>
         <w:t>| [</w:t>
       </w:r>
+      <w:proofErr w:type="spellStart"/>
       <w:r>
         <w:t>Participant_ID</w:t>
       </w:r>
+      <w:proofErr w:type="spellEnd"/>
       <w:r>
         <w:t>] | # | # | # | # | # | [e.g., Neuroticism] | [e.g., "Aligned with stats" OR "Outlier: High N but High C"] |</w:t>
       </w:r>
@@ -1269,7 +1429,15 @@
     </w:p>
     <w:p>
       <w:r>
-        <w:t xml:space="preserve">You are about to read a conversation log from a research participant. Read the text carefully to understand their tone, syntax, sentence structure, and emotional state. Do not analyze it </w:t>
+        <w:t xml:space="preserve">You are about to read a conversation log from a research participant. Read the text carefully to understand their tone, syntax, sentence structure, and emotional state. Do not </w:t>
+      </w:r>
+      <w:proofErr w:type="spellStart"/>
+      <w:r>
+        <w:t>analyze</w:t>
+      </w:r>
+      <w:proofErr w:type="spellEnd"/>
+      <w:r>
+        <w:t xml:space="preserve"> it </w:t>
       </w:r>
       <w:proofErr w:type="gramStart"/>
       <w:r>
@@ -2241,6 +2409,7 @@
   <w:style w:type="character" w:default="1" w:styleId="DefaultParagraphFont">
     <w:name w:val="Default Paragraph Font"/>
     <w:uiPriority w:val="1"/>
+    <w:semiHidden/>
     <w:unhideWhenUsed/>
   </w:style>
   <w:style w:type="table" w:default="1" w:styleId="TableNormal">

</xml_diff>